<commit_message>
Shorten cell text in the Word comparison table
Co-Authored-By: Claude Sonnet 5.5 <noreply@anthropic.com>
Claude-Session: https://claude.ai/code/session_01VLRxR7cQrXwpKSXSDmKTib
</commit_message>
<xml_diff>
--- a/表4-1_取引費用論による日米比較.docx
+++ b/表4-1_取引費用論による日米比較.docx
@@ -68,7 +68,7 @@
         </w:tc>
         <w:tc>
           <w:tcPr>
-            <w:tcW w:type="dxa" w:w="3118"/>
+            <w:tcW w:type="dxa" w:w="3005"/>
             <w:vAlign w:val="center"/>
             <w:shd w:val="clear" w:color="auto" w:fill="A51C30"/>
             <w:tcBorders>
@@ -101,7 +101,7 @@
         </w:tc>
         <w:tc>
           <w:tcPr>
-            <w:tcW w:type="dxa" w:w="3118"/>
+            <w:tcW w:type="dxa" w:w="3231"/>
             <w:vAlign w:val="center"/>
             <w:shd w:val="clear" w:color="auto" w:fill="A51C30"/>
             <w:tcBorders>
@@ -204,7 +204,7 @@
         </w:tc>
         <w:tc>
           <w:tcPr>
-            <w:tcW w:type="dxa" w:w="3118"/>
+            <w:tcW w:type="dxa" w:w="3005"/>
             <w:vAlign w:val="center"/>
             <w:shd w:val="clear" w:color="auto" w:fill="FFFFFF"/>
             <w:tcBorders>
@@ -230,13 +230,13 @@
                 <w:b w:val="0"/>
                 <w:sz w:val="20"/>
               </w:rPr>
-              <w:t>高い。Amazon専属の運送会社で、専用車両（ロゴ入りバン）を使用し、ドライバーは制服を着用する</w:t>
+              <w:t>高い。専属・専用車両・ロゴ入り</w:t>
             </w:r>
           </w:p>
         </w:tc>
         <w:tc>
           <w:tcPr>
-            <w:tcW w:type="dxa" w:w="3118"/>
+            <w:tcW w:type="dxa" w:w="3231"/>
             <w:vAlign w:val="center"/>
             <w:shd w:val="clear" w:color="auto" w:fill="FFFFFF"/>
             <w:tcBorders>
@@ -262,7 +262,7 @@
                 <w:b w:val="0"/>
                 <w:sz w:val="20"/>
               </w:rPr>
-              <w:t>相対的に低い※。既存の地域運送業者で、他の荷主の業務も持つ（対Amazon売上依存度：17.5〜69.9％、2021年）</w:t>
+              <w:t>相対的に低い※。既存事業者で他荷主あり（依存度17.5〜69.9％）</w:t>
             </w:r>
           </w:p>
         </w:tc>
@@ -307,7 +307,7 @@
                 <w:b w:val="0"/>
                 <w:sz w:val="18"/>
               </w:rPr>
-              <w:t>pp.49-50, 58, 65</w:t>
+              <w:t>pp.49-50, 58</w:t>
             </w:r>
           </w:p>
         </w:tc>
@@ -350,7 +350,7 @@
         </w:tc>
         <w:tc>
           <w:tcPr>
-            <w:tcW w:type="dxa" w:w="3118"/>
+            <w:tcW w:type="dxa" w:w="3005"/>
             <w:vAlign w:val="center"/>
             <w:shd w:val="clear" w:color="auto" w:fill="FCEBD5"/>
             <w:tcBorders>
@@ -376,13 +376,13 @@
                 <w:b w:val="0"/>
                 <w:sz w:val="20"/>
               </w:rPr>
-              <w:t>強い。車載カメラ・テレマティクス・アプリで常時監視し、週次のスコアで評価する。評価が低い場合は契約が解除される</w:t>
+              <w:t>強い。車載カメラ・アプリ・週次評価、低評価は解約</w:t>
             </w:r>
           </w:p>
         </w:tc>
         <w:tc>
           <w:tcPr>
-            <w:tcW w:type="dxa" w:w="3118"/>
+            <w:tcW w:type="dxa" w:w="3231"/>
             <w:vAlign w:val="center"/>
             <w:shd w:val="clear" w:color="auto" w:fill="FCEBD5"/>
             <w:tcBorders>
@@ -408,7 +408,7 @@
                 <w:b w:val="0"/>
                 <w:sz w:val="20"/>
               </w:rPr>
-              <w:t>弱い。Amazonが配送業務を監視・統制することは行っていないと報告されている</w:t>
+              <w:t>弱い。監視・統制は行っていない</w:t>
             </w:r>
           </w:p>
         </w:tc>
@@ -496,7 +496,7 @@
         </w:tc>
         <w:tc>
           <w:tcPr>
-            <w:tcW w:type="dxa" w:w="3118"/>
+            <w:tcW w:type="dxa" w:w="3005"/>
             <w:vAlign w:val="center"/>
             <w:shd w:val="clear" w:color="auto" w:fill="FFFFFF"/>
             <w:tcBorders>
@@ -522,13 +522,13 @@
                 <w:b w:val="0"/>
                 <w:sz w:val="20"/>
               </w:rPr>
-              <w:t>専属契約によるフランチャイズ型</w:t>
+              <w:t>専属契約（フランチャイズ型）</w:t>
             </w:r>
           </w:p>
         </w:tc>
         <w:tc>
           <w:tcPr>
-            <w:tcW w:type="dxa" w:w="3118"/>
+            <w:tcW w:type="dxa" w:w="3231"/>
             <w:vAlign w:val="center"/>
             <w:shd w:val="clear" w:color="auto" w:fill="FFFFFF"/>
             <w:tcBorders>
@@ -554,7 +554,7 @@
                 <w:b w:val="0"/>
                 <w:sz w:val="20"/>
               </w:rPr>
-              <w:t>単純委託。実際の配送は協力会社や個人の軽貨物運送業者への下請が中心</w:t>
+              <w:t>単純委託。協力会社・個人へ下請</w:t>
             </w:r>
           </w:p>
         </w:tc>
@@ -599,7 +599,7 @@
                 <w:b w:val="0"/>
                 <w:sz w:val="18"/>
               </w:rPr>
-              <w:t>pp.50, 60, 65</w:t>
+              <w:t>pp.50, 60</w:t>
             </w:r>
           </w:p>
         </w:tc>
@@ -642,7 +642,7 @@
         </w:tc>
         <w:tc>
           <w:tcPr>
-            <w:tcW w:type="dxa" w:w="3118"/>
+            <w:tcW w:type="dxa" w:w="3005"/>
             <w:vAlign w:val="center"/>
             <w:shd w:val="clear" w:color="auto" w:fill="FCEBD5"/>
             <w:tcBorders>
@@ -668,13 +668,13 @@
                 <w:b w:val="0"/>
                 <w:sz w:val="20"/>
               </w:rPr>
-              <w:t>2013年の年末商戦での大規模な遅配</w:t>
+              <w:t>2013年の大規模遅配</w:t>
             </w:r>
           </w:p>
         </w:tc>
         <w:tc>
           <w:tcPr>
-            <w:tcW w:type="dxa" w:w="3118"/>
+            <w:tcW w:type="dxa" w:w="3231"/>
             <w:vAlign w:val="center"/>
             <w:shd w:val="clear" w:color="auto" w:fill="FCEBD5"/>
             <w:tcBorders>
@@ -700,7 +700,7 @@
                 <w:b w:val="0"/>
                 <w:sz w:val="20"/>
               </w:rPr>
-              <w:t>2017年の宅配クライシス（総量規制・運賃40％上昇）</w:t>
+              <w:t>2017年の宅配クライシス</w:t>
             </w:r>
           </w:p>
         </w:tc>
@@ -788,7 +788,7 @@
         </w:tc>
         <w:tc>
           <w:tcPr>
-            <w:tcW w:type="dxa" w:w="3118"/>
+            <w:tcW w:type="dxa" w:w="3005"/>
             <w:vAlign w:val="center"/>
             <w:shd w:val="clear" w:color="auto" w:fill="FFFFFF"/>
             <w:tcBorders>
@@ -814,13 +814,13 @@
                 <w:b w:val="0"/>
                 <w:sz w:val="20"/>
               </w:rPr>
-              <w:t>高い。Amazon Logisticsの取扱個数は2019年19億個、2020年42億個</w:t>
+              <w:t>高い（2020年42億個）</w:t>
             </w:r>
           </w:p>
         </w:tc>
         <w:tc>
           <w:tcPr>
-            <w:tcW w:type="dxa" w:w="3118"/>
+            <w:tcW w:type="dxa" w:w="3231"/>
             <w:vAlign w:val="center"/>
             <w:shd w:val="clear" w:color="auto" w:fill="FFFFFF"/>
             <w:tcBorders>
@@ -846,7 +846,7 @@
                 <w:b w:val="0"/>
                 <w:sz w:val="20"/>
               </w:rPr>
-              <w:t>高い。2021年の出荷約7億個のうち約半数を自社物流で配送</w:t>
+              <w:t>高い（2021年約7億個、半数は自社物流）</w:t>
             </w:r>
           </w:p>
         </w:tc>
@@ -907,7 +907,7 @@
           <w:b w:val="0"/>
           <w:sz w:val="18"/>
         </w:rPr>
-        <w:t>（注）本表は文献に基づく整理であり、両方式の優劣を評価するものではない。日本にもDSPが存在するが、本表は日本の主要な地域事業者であるADPを対象とした。※は筆者の解釈（推論）を示す。</w:t>
+        <w:t>（注）文献に基づく整理であり、優劣の評価ではない。日本にもDSPがあるが、本表は主要な地域事業者ADPを対象とした。※は筆者の推論。</w:t>
       </w:r>
     </w:p>
     <w:p>

</xml_diff>